<commit_message>
S03: comentarios tras revisión P2P
</commit_message>
<xml_diff>
--- a/03-s03-bigquery-sql-nube/s03-bigquery-sql-nube-evidencias.docx
+++ b/03-s03-bigquery-sql-nube/s03-bigquery-sql-nube-evidencias.docx
@@ -202,7 +202,7 @@
                 <w:color w:val="666666"/>
                 <w:sz w:val="21"/>
               </w:rPr>
-              <w:t>[Nombre de quien reviso el P2P]</w:t>
+              <w:t>Gabriela</w:t>
             </w:r>
           </w:p>
         </w:tc>
@@ -249,7 +249,7 @@
                 <w:color w:val="666666"/>
                 <w:sz w:val="21"/>
               </w:rPr>
-              <w:t>[DD/MM/AAAA]</w:t>
+              <w:t>13/10/2026</w:t>
             </w:r>
           </w:p>
         </w:tc>
@@ -290,14 +290,14 @@
             </w:tcBorders>
           </w:tcPr>
           <w:p>
-            <w:r>
-              <w:rPr>
-                <w:i/>
-                <w:color w:val="666666"/>
-                <w:sz w:val="21"/>
-              </w:rPr>
-              <w:t>[enlace al repositorio]</w:t>
-            </w:r>
+            <w:hyperlink r:id="rId8" w:history="1">
+              <w:r>
+                <w:rPr>
+                  <w:rStyle w:val="Hipervnculo"/>
+                </w:rPr>
+                <w:t>https://github.com/chisamitsu/ita-dataanalytics/tree/main/03-s03-bigquery-sql-nube</w:t>
+              </w:r>
+            </w:hyperlink>
           </w:p>
         </w:tc>
       </w:tr>
@@ -501,7 +501,7 @@
                           <pic:cNvPicPr/>
                         </pic:nvPicPr>
                         <pic:blipFill>
-                          <a:blip r:embed="rId8"/>
+                          <a:blip r:embed="rId9"/>
                           <a:stretch>
                             <a:fillRect/>
                           </a:stretch>
@@ -610,7 +610,7 @@
                           <pic:cNvPicPr/>
                         </pic:nvPicPr>
                         <pic:blipFill>
-                          <a:blip r:embed="rId9"/>
+                          <a:blip r:embed="rId10"/>
                           <a:stretch>
                             <a:fillRect/>
                           </a:stretch>
@@ -655,7 +655,7 @@
                           <pic:cNvPicPr/>
                         </pic:nvPicPr>
                         <pic:blipFill>
-                          <a:blip r:embed="rId10"/>
+                          <a:blip r:embed="rId11"/>
                           <a:stretch>
                             <a:fillRect/>
                           </a:stretch>
@@ -763,7 +763,7 @@
                           <pic:cNvPicPr/>
                         </pic:nvPicPr>
                         <pic:blipFill>
-                          <a:blip r:embed="rId11"/>
+                          <a:blip r:embed="rId12"/>
                           <a:stretch>
                             <a:fillRect/>
                           </a:stretch>
@@ -803,7 +803,7 @@
                           <pic:cNvPicPr/>
                         </pic:nvPicPr>
                         <pic:blipFill>
-                          <a:blip r:embed="rId12"/>
+                          <a:blip r:embed="rId13"/>
                           <a:stretch>
                             <a:fillRect/>
                           </a:stretch>
@@ -912,7 +912,7 @@
                           <pic:cNvPicPr/>
                         </pic:nvPicPr>
                         <pic:blipFill>
-                          <a:blip r:embed="rId13"/>
+                          <a:blip r:embed="rId14"/>
                           <a:stretch>
                             <a:fillRect/>
                           </a:stretch>
@@ -1028,7 +1028,7 @@
                           <pic:cNvPicPr/>
                         </pic:nvPicPr>
                         <pic:blipFill>
-                          <a:blip r:embed="rId14"/>
+                          <a:blip r:embed="rId15"/>
                           <a:stretch>
                             <a:fillRect/>
                           </a:stretch>
@@ -1126,7 +1126,7 @@
                           <pic:cNvPicPr/>
                         </pic:nvPicPr>
                         <pic:blipFill>
-                          <a:blip r:embed="rId15"/>
+                          <a:blip r:embed="rId16"/>
                           <a:stretch>
                             <a:fillRect/>
                           </a:stretch>
@@ -1208,7 +1208,7 @@
                     <pic:cNvPicPr/>
                   </pic:nvPicPr>
                   <pic:blipFill>
-                    <a:blip r:embed="rId16"/>
+                    <a:blip r:embed="rId17"/>
                     <a:stretch>
                       <a:fillRect/>
                     </a:stretch>
@@ -1610,7 +1610,7 @@
                           <pic:cNvPicPr/>
                         </pic:nvPicPr>
                         <pic:blipFill>
-                          <a:blip r:embed="rId17"/>
+                          <a:blip r:embed="rId18"/>
                           <a:stretch>
                             <a:fillRect/>
                           </a:stretch>
@@ -1715,7 +1715,7 @@
                           <pic:cNvPicPr/>
                         </pic:nvPicPr>
                         <pic:blipFill>
-                          <a:blip r:embed="rId18"/>
+                          <a:blip r:embed="rId19"/>
                           <a:stretch>
                             <a:fillRect/>
                           </a:stretch>
@@ -1803,7 +1803,7 @@
                           <pic:cNvPicPr/>
                         </pic:nvPicPr>
                         <pic:blipFill rotWithShape="1">
-                          <a:blip r:embed="rId19"/>
+                          <a:blip r:embed="rId20"/>
                           <a:srcRect r="29683"/>
                           <a:stretch>
                             <a:fillRect/>
@@ -1946,7 +1946,7 @@
                           <pic:cNvPicPr/>
                         </pic:nvPicPr>
                         <pic:blipFill>
-                          <a:blip r:embed="rId20"/>
+                          <a:blip r:embed="rId21"/>
                           <a:stretch>
                             <a:fillRect/>
                           </a:stretch>
@@ -2035,7 +2035,7 @@
                           <pic:cNvPicPr/>
                         </pic:nvPicPr>
                         <pic:blipFill>
-                          <a:blip r:embed="rId21"/>
+                          <a:blip r:embed="rId22"/>
                           <a:stretch>
                             <a:fillRect/>
                           </a:stretch>
@@ -2195,7 +2195,7 @@
                           <pic:cNvPicPr/>
                         </pic:nvPicPr>
                         <pic:blipFill>
-                          <a:blip r:embed="rId22"/>
+                          <a:blip r:embed="rId23"/>
                           <a:stretch>
                             <a:fillRect/>
                           </a:stretch>
@@ -2238,7 +2238,7 @@
                           <pic:cNvPicPr/>
                         </pic:nvPicPr>
                         <pic:blipFill>
-                          <a:blip r:embed="rId23"/>
+                          <a:blip r:embed="rId24"/>
                           <a:stretch>
                             <a:fillRect/>
                           </a:stretch>
@@ -2446,7 +2446,7 @@
                           <pic:cNvPicPr/>
                         </pic:nvPicPr>
                         <pic:blipFill>
-                          <a:blip r:embed="rId24"/>
+                          <a:blip r:embed="rId25"/>
                           <a:stretch>
                             <a:fillRect/>
                           </a:stretch>
@@ -2489,7 +2489,7 @@
                           <pic:cNvPicPr/>
                         </pic:nvPicPr>
                         <pic:blipFill>
-                          <a:blip r:embed="rId25"/>
+                          <a:blip r:embed="rId26"/>
                           <a:stretch>
                             <a:fillRect/>
                           </a:stretch>
@@ -2577,7 +2577,7 @@
                           <pic:cNvPicPr/>
                         </pic:nvPicPr>
                         <pic:blipFill>
-                          <a:blip r:embed="rId26"/>
+                          <a:blip r:embed="rId27"/>
                           <a:stretch>
                             <a:fillRect/>
                           </a:stretch>
@@ -2622,7 +2622,7 @@
                           <pic:cNvPicPr/>
                         </pic:nvPicPr>
                         <pic:blipFill>
-                          <a:blip r:embed="rId27"/>
+                          <a:blip r:embed="rId28"/>
                           <a:stretch>
                             <a:fillRect/>
                           </a:stretch>
@@ -2744,7 +2744,7 @@
                           <pic:cNvPicPr/>
                         </pic:nvPicPr>
                         <pic:blipFill>
-                          <a:blip r:embed="rId28"/>
+                          <a:blip r:embed="rId29"/>
                           <a:stretch>
                             <a:fillRect/>
                           </a:stretch>
@@ -2814,7 +2814,7 @@
                           <pic:cNvPicPr/>
                         </pic:nvPicPr>
                         <pic:blipFill>
-                          <a:blip r:embed="rId29"/>
+                          <a:blip r:embed="rId30"/>
                           <a:stretch>
                             <a:fillRect/>
                           </a:stretch>
@@ -2909,7 +2909,7 @@
                           <pic:cNvPicPr/>
                         </pic:nvPicPr>
                         <pic:blipFill>
-                          <a:blip r:embed="rId30"/>
+                          <a:blip r:embed="rId31"/>
                           <a:stretch>
                             <a:fillRect/>
                           </a:stretch>
@@ -2982,7 +2982,7 @@
                           <pic:cNvPicPr/>
                         </pic:nvPicPr>
                         <pic:blipFill>
-                          <a:blip r:embed="rId31"/>
+                          <a:blip r:embed="rId32"/>
                           <a:stretch>
                             <a:fillRect/>
                           </a:stretch>
@@ -3333,7 +3333,7 @@
                           <pic:cNvPicPr/>
                         </pic:nvPicPr>
                         <pic:blipFill>
-                          <a:blip r:embed="rId32"/>
+                          <a:blip r:embed="rId33"/>
                           <a:stretch>
                             <a:fillRect/>
                           </a:stretch>
@@ -3431,8 +3431,10 @@
         <w:t xml:space="preserve"> </w:t>
       </w:r>
       <w:r>
-        <w:t xml:space="preserve">antes de aplicar DATE()/EXTRACT(). </w:t>
-      </w:r>
+        <w:t>antes de aplicar DATE()/EXTRACT().</w:t>
+      </w:r>
+    </w:p>
+    <w:p>
       <w:proofErr w:type="spellStart"/>
       <w:r>
         <w:t>amount</w:t>
@@ -3471,7 +3473,15 @@
         <w:t>FLOAT64</w:t>
       </w:r>
       <w:r>
-        <w:t>.</w:t>
+        <w:t xml:space="preserve"> (para un mejor resultado, podría usar </w:t>
+      </w:r>
+      <w:proofErr w:type="gramStart"/>
+      <w:r>
+        <w:t>ROUND</w:t>
+      </w:r>
+      <w:proofErr w:type="gramEnd"/>
+      <w:r>
+        <w:t xml:space="preserve"> para mantener 2 dígitos).</w:t>
       </w:r>
     </w:p>
     <w:p>
@@ -3645,7 +3655,7 @@
                           <pic:cNvPicPr/>
                         </pic:nvPicPr>
                         <pic:blipFill>
-                          <a:blip r:embed="rId33"/>
+                          <a:blip r:embed="rId34"/>
                           <a:stretch>
                             <a:fillRect/>
                           </a:stretch>
@@ -3766,7 +3776,7 @@
                     <pic:cNvPicPr/>
                   </pic:nvPicPr>
                   <pic:blipFill>
-                    <a:blip r:embed="rId34"/>
+                    <a:blip r:embed="rId35"/>
                     <a:stretch>
                       <a:fillRect/>
                     </a:stretch>
@@ -4078,7 +4088,7 @@
                           <pic:cNvPicPr/>
                         </pic:nvPicPr>
                         <pic:blipFill>
-                          <a:blip r:embed="rId35"/>
+                          <a:blip r:embed="rId36"/>
                           <a:stretch>
                             <a:fillRect/>
                           </a:stretch>
@@ -4398,7 +4408,7 @@
                           <pic:cNvPicPr/>
                         </pic:nvPicPr>
                         <pic:blipFill>
-                          <a:blip r:embed="rId36"/>
+                          <a:blip r:embed="rId37"/>
                           <a:stretch>
                             <a:fillRect/>
                           </a:stretch>
@@ -4611,7 +4621,7 @@
                           <pic:cNvPicPr/>
                         </pic:nvPicPr>
                         <pic:blipFill>
-                          <a:blip r:embed="rId37"/>
+                          <a:blip r:embed="rId38"/>
                           <a:stretch>
                             <a:fillRect/>
                           </a:stretch>
@@ -4743,7 +4753,7 @@
                           <pic:cNvPicPr/>
                         </pic:nvPicPr>
                         <pic:blipFill>
-                          <a:blip r:embed="rId38"/>
+                          <a:blip r:embed="rId39"/>
                           <a:stretch>
                             <a:fillRect/>
                           </a:stretch>
@@ -4992,7 +5002,7 @@
                           <pic:cNvPicPr/>
                         </pic:nvPicPr>
                         <pic:blipFill>
-                          <a:blip r:embed="rId39"/>
+                          <a:blip r:embed="rId40"/>
                           <a:stretch>
                             <a:fillRect/>
                           </a:stretch>
@@ -5331,7 +5341,7 @@
                           <pic:cNvPicPr/>
                         </pic:nvPicPr>
                         <pic:blipFill>
-                          <a:blip r:embed="rId40"/>
+                          <a:blip r:embed="rId41"/>
                           <a:stretch>
                             <a:fillRect/>
                           </a:stretch>
@@ -5454,6 +5464,9 @@
               <w:spacing w:line="240" w:lineRule="auto"/>
             </w:pPr>
             <w:r>
+              <w:rPr>
+                <w:noProof/>
+              </w:rPr>
               <w:drawing>
                 <wp:inline distT="0" distB="0" distL="0" distR="0" wp14:anchorId="06F65885" wp14:editId="49A59111">
                   <wp:extent cx="4593600" cy="2491200"/>
@@ -5470,7 +5483,7 @@
                           <pic:cNvPicPr/>
                         </pic:nvPicPr>
                         <pic:blipFill>
-                          <a:blip r:embed="rId41"/>
+                          <a:blip r:embed="rId42"/>
                           <a:stretch>
                             <a:fillRect/>
                           </a:stretch>
@@ -5511,7 +5524,7 @@
                           <pic:cNvPicPr/>
                         </pic:nvPicPr>
                         <pic:blipFill>
-                          <a:blip r:embed="rId42"/>
+                          <a:blip r:embed="rId43"/>
                           <a:stretch>
                             <a:fillRect/>
                           </a:stretch>
@@ -5537,7 +5550,7 @@
     </w:tbl>
     <w:p/>
     <w:sectPr>
-      <w:footerReference w:type="default" r:id="rId43"/>
+      <w:footerReference w:type="default" r:id="rId44"/>
       <w:pgSz w:w="12240" w:h="15840"/>
       <w:pgMar w:top="720" w:right="720" w:bottom="720" w:left="720" w:header="720" w:footer="720" w:gutter="0"/>
       <w:cols w:space="720"/>

</xml_diff>